<commit_message>
Commit after 15 placed
</commit_message>
<xml_diff>
--- a/main/Meesho/Data_Scientist_1/common.docx
+++ b/main/Meesho/Data_Scientist_1/common.docx
@@ -216,9 +216,9 @@
       <w:pPr>
         <w:spacing w:after="200" w:line="240" w:lineRule="auto"/>
         <w:rPr>
-          <w:rFonts w:asciiTheme="majorHAnsi" w:hAnsiTheme="majorHAnsi" w:eastAsiaTheme="majorEastAsia" w:cstheme="majorBidi"/>
-          <w:b/>
-          <w:bCs/>
+          <w:rFonts w:ascii="Aptos Display" w:hAnsi="Aptos Display" w:eastAsia="" w:cs="" w:asciiTheme="majorAscii" w:hAnsiTheme="majorAscii" w:eastAsiaTheme="majorEastAsia" w:cstheme="majorBidi"/>
+          <w:b w:val="1"/>
+          <w:bCs w:val="1"/>
           <w:color w:val="365F91"/>
           <w:sz w:val="28"/>
           <w:szCs w:val="28"/>
@@ -226,9 +226,9 @@
       </w:pPr>
       <w:r>
         <w:rPr>
-          <w:rFonts w:asciiTheme="majorHAnsi" w:hAnsiTheme="majorHAnsi" w:eastAsiaTheme="majorEastAsia" w:cstheme="majorBidi"/>
-          <w:b/>
-          <w:bCs/>
+          <w:rFonts w:ascii="Aptos Display" w:hAnsi="Aptos Display" w:eastAsia="" w:cs="" w:asciiTheme="majorAscii" w:hAnsiTheme="majorAscii" w:eastAsiaTheme="majorEastAsia" w:cstheme="majorBidi"/>
+          <w:b w:val="1"/>
+          <w:bCs w:val="1"/>
           <w:sz w:val="22"/>
           <w:szCs w:val="22"/>
         </w:rPr>
@@ -236,7 +236,7 @@
       </w:r>
       <w:r>
         <w:rPr>
-          <w:rFonts w:asciiTheme="majorHAnsi" w:hAnsiTheme="majorHAnsi" w:eastAsiaTheme="majorEastAsia" w:cstheme="majorBidi"/>
+          <w:rFonts w:ascii="Aptos Display" w:hAnsi="Aptos Display" w:eastAsia="" w:cs="" w:asciiTheme="majorAscii" w:hAnsiTheme="majorAscii" w:eastAsiaTheme="majorEastAsia" w:cstheme="majorBidi"/>
           <w:sz w:val="22"/>
           <w:szCs w:val="22"/>
         </w:rPr>
@@ -244,11 +244,27 @@
       </w:r>
       <w:r>
         <w:rPr>
-          <w:rFonts w:asciiTheme="majorHAnsi" w:hAnsiTheme="majorHAnsi" w:eastAsiaTheme="majorEastAsia" w:cstheme="majorBidi"/>
-          <w:sz w:val="22"/>
-          <w:szCs w:val="22"/>
-        </w:rPr>
-        <w:t>Rejected after second round.</w:t>
+          <w:rFonts w:ascii="Aptos Display" w:hAnsi="Aptos Display" w:eastAsia="" w:cs="" w:asciiTheme="majorAscii" w:hAnsiTheme="majorAscii" w:eastAsiaTheme="majorEastAsia" w:cstheme="majorBidi"/>
+          <w:sz w:val="22"/>
+          <w:szCs w:val="22"/>
+        </w:rPr>
+        <w:t>Rejected</w:t>
+      </w:r>
+      <w:r>
+        <w:rPr>
+          <w:rFonts w:ascii="Aptos Display" w:hAnsi="Aptos Display" w:eastAsia="" w:cs="" w:asciiTheme="majorAscii" w:hAnsiTheme="majorAscii" w:eastAsiaTheme="majorEastAsia" w:cstheme="majorBidi"/>
+          <w:sz w:val="22"/>
+          <w:szCs w:val="22"/>
+        </w:rPr>
+        <w:t xml:space="preserve"> in last round</w:t>
+      </w:r>
+      <w:r>
+        <w:rPr>
+          <w:rFonts w:ascii="Aptos Display" w:hAnsi="Aptos Display" w:eastAsia="" w:cs="" w:asciiTheme="majorAscii" w:hAnsiTheme="majorAscii" w:eastAsiaTheme="majorEastAsia" w:cstheme="majorBidi"/>
+          <w:sz w:val="22"/>
+          <w:szCs w:val="22"/>
+        </w:rPr>
+        <w:t>.</w:t>
       </w:r>
     </w:p>
     <w:p>

</xml_diff>